<commit_message>
Add new HTML file old1.html
</commit_message>
<xml_diff>
--- a/English literature prompt.docx
+++ b/English literature prompt.docx
@@ -239,24 +239,152 @@
       </w:r>
     </w:p>
     <w:p>
-      <w:pPr>
-        <w:rPr>
-          <w:b/>
-          <w:bCs/>
-        </w:rPr>
-      </w:pPr>
-      <w:r>
-        <w:rPr>
-          <w:lang w:val="en-US"/>
-        </w:rPr>
-        <w:t>```</w:t>
+      <w:r>
+        <w:rPr>
+          <w:lang w:val="en-US"/>
+        </w:rPr>
+        <w:t>``</w:t>
+      </w:r>
+      <w:proofErr w:type="gramStart"/>
+      <w:r>
+        <w:rPr>
+          <w:lang w:val="en-US"/>
+        </w:rPr>
+        <w:t>`</w:t>
       </w:r>
       <w:r>
         <w:t> </w:t>
       </w:r>
+      <w:r>
+        <w:t> {</w:t>
+      </w:r>
+      <w:proofErr w:type="gramEnd"/>
+      <w:r>
+        <w:t xml:space="preserve"> q</w:t>
+      </w:r>
+      <w:r>
+        <w:rPr>
+          <w:b/>
+          <w:bCs/>
+        </w:rPr>
+        <w:t>:</w:t>
+      </w:r>
+      <w:r>
+        <w:t xml:space="preserve"> "Complete the word correctly: Fr _ _ </w:t>
+      </w:r>
+      <w:proofErr w:type="spellStart"/>
+      <w:r>
+        <w:t>nd</w:t>
+      </w:r>
+      <w:proofErr w:type="spellEnd"/>
+      <w:r>
+        <w:t>"</w:t>
+      </w:r>
+      <w:r>
+        <w:rPr>
+          <w:b/>
+          <w:bCs/>
+        </w:rPr>
+        <w:t>,</w:t>
+      </w:r>
+      <w:r>
+        <w:t xml:space="preserve"> a</w:t>
+      </w:r>
+      <w:r>
+        <w:rPr>
+          <w:b/>
+          <w:bCs/>
+        </w:rPr>
+        <w:t>:</w:t>
+      </w:r>
+      <w:r>
+        <w:t xml:space="preserve"> "</w:t>
+      </w:r>
+      <w:proofErr w:type="spellStart"/>
+      <w:r>
+        <w:t>ie</w:t>
+      </w:r>
+      <w:proofErr w:type="spellEnd"/>
+      <w:r>
+        <w:t>"</w:t>
+      </w:r>
+      <w:r>
+        <w:rPr>
+          <w:b/>
+          <w:bCs/>
+        </w:rPr>
+        <w:t>,</w:t>
+      </w:r>
+      <w:r>
+        <w:t xml:space="preserve"> options</w:t>
+      </w:r>
+      <w:r>
+        <w:rPr>
+          <w:b/>
+          <w:bCs/>
+        </w:rPr>
+        <w:t>:</w:t>
+      </w:r>
+      <w:r>
+        <w:t xml:space="preserve"> ["</w:t>
+      </w:r>
+      <w:proofErr w:type="spellStart"/>
+      <w:r>
+        <w:t>ie</w:t>
+      </w:r>
+      <w:proofErr w:type="spellEnd"/>
+      <w:r>
+        <w:t>"</w:t>
+      </w:r>
+      <w:r>
+        <w:rPr>
+          <w:b/>
+          <w:bCs/>
+        </w:rPr>
+        <w:t>,</w:t>
+      </w:r>
+      <w:r>
+        <w:t xml:space="preserve"> "</w:t>
+      </w:r>
+      <w:proofErr w:type="spellStart"/>
+      <w:r>
+        <w:t>ei</w:t>
+      </w:r>
+      <w:proofErr w:type="spellEnd"/>
+      <w:r>
+        <w:t>"</w:t>
+      </w:r>
+      <w:r>
+        <w:rPr>
+          <w:b/>
+          <w:bCs/>
+        </w:rPr>
+        <w:t>,</w:t>
+      </w:r>
+      <w:r>
+        <w:t xml:space="preserve"> "</w:t>
+      </w:r>
+      <w:proofErr w:type="spellStart"/>
+      <w:r>
+        <w:t>ea</w:t>
+      </w:r>
+      <w:proofErr w:type="spellEnd"/>
+      <w:r>
+        <w:t>"</w:t>
+      </w:r>
+      <w:r>
+        <w:rPr>
+          <w:b/>
+          <w:bCs/>
+        </w:rPr>
+        <w:t>,</w:t>
+      </w:r>
+      <w:r>
+        <w:t xml:space="preserve"> "ee"</w:t>
+      </w:r>
       <w:proofErr w:type="gramStart"/>
       <w:r>
-        <w:t>{ q</w:t>
+        <w:t>] }</w:t>
       </w:r>
       <w:proofErr w:type="gramEnd"/>
       <w:r>
@@ -264,118 +392,142 @@
           <w:b/>
           <w:bCs/>
         </w:rPr>
-        <w:t>:</w:t>
-      </w:r>
-      <w:r>
-        <w:t xml:space="preserve"> "Choose the correct spelling:"</w:t>
-      </w:r>
-      <w:r>
-        <w:rPr>
-          <w:b/>
-          <w:bCs/>
-        </w:rPr>
         <w:t>,</w:t>
       </w:r>
-      <w:r>
-        <w:t xml:space="preserve"> a</w:t>
-      </w:r>
-      <w:r>
-        <w:rPr>
-          <w:b/>
-          <w:bCs/>
-        </w:rPr>
-        <w:t>:</w:t>
-      </w:r>
-      <w:r>
-        <w:t xml:space="preserve"> "Suddenly"</w:t>
-      </w:r>
-      <w:r>
-        <w:rPr>
-          <w:b/>
-          <w:bCs/>
-        </w:rPr>
-        <w:t>,</w:t>
-      </w:r>
-      <w:r>
-        <w:t xml:space="preserve"> options</w:t>
-      </w:r>
-      <w:r>
-        <w:rPr>
-          <w:b/>
-          <w:bCs/>
-        </w:rPr>
-        <w:t>:</w:t>
-      </w:r>
-      <w:r>
-        <w:t xml:space="preserve"> ["Suddenly"</w:t>
-      </w:r>
-      <w:r>
-        <w:rPr>
-          <w:b/>
-          <w:bCs/>
-        </w:rPr>
-        <w:t>,</w:t>
-      </w:r>
-      <w:r>
-        <w:t xml:space="preserve"> "</w:t>
-      </w:r>
-      <w:proofErr w:type="spellStart"/>
-      <w:r>
-        <w:t>Sudenly</w:t>
-      </w:r>
-      <w:proofErr w:type="spellEnd"/>
-      <w:r>
-        <w:t>"</w:t>
-      </w:r>
-      <w:r>
-        <w:rPr>
-          <w:b/>
-          <w:bCs/>
-        </w:rPr>
-        <w:t>,</w:t>
-      </w:r>
-      <w:r>
-        <w:t xml:space="preserve"> "</w:t>
-      </w:r>
-      <w:proofErr w:type="spellStart"/>
-      <w:r>
-        <w:t>Suddnly</w:t>
-      </w:r>
-      <w:proofErr w:type="spellEnd"/>
-      <w:r>
-        <w:t>"</w:t>
-      </w:r>
-      <w:r>
-        <w:rPr>
-          <w:b/>
-          <w:bCs/>
-        </w:rPr>
-        <w:t>,</w:t>
-      </w:r>
-      <w:r>
-        <w:t xml:space="preserve"> "</w:t>
-      </w:r>
-      <w:proofErr w:type="spellStart"/>
-      <w:r>
-        <w:t>Sudenley</w:t>
-      </w:r>
-      <w:proofErr w:type="spellEnd"/>
-      <w:r>
-        <w:t>"</w:t>
-      </w:r>
-      <w:proofErr w:type="gramStart"/>
-      <w:r>
-        <w:t>] }</w:t>
-      </w:r>
-      <w:proofErr w:type="gramEnd"/>
     </w:p>
     <w:p>
-      <w:pPr>
-        <w:rPr>
-          <w:b/>
-          <w:bCs/>
-        </w:rPr>
-      </w:pPr>
+      <w:proofErr w:type="gramStart"/>
+      <w:r>
+        <w:t>            { q</w:t>
+      </w:r>
+      <w:r>
+        <w:rPr>
+          <w:b/>
+          <w:bCs/>
+        </w:rPr>
+        <w:t>:</w:t>
+      </w:r>
+      <w:r>
+        <w:t xml:space="preserve"> "Complete the word correctly: R _ c _ _ ve"</w:t>
+      </w:r>
+      <w:r>
+        <w:rPr>
+          <w:b/>
+          <w:bCs/>
+        </w:rPr>
+        <w:t>,</w:t>
+      </w:r>
+      <w:r>
+        <w:t xml:space="preserve"> a</w:t>
+      </w:r>
+      <w:r>
+        <w:rPr>
+          <w:b/>
+          <w:bCs/>
+        </w:rPr>
+        <w:t>:</w:t>
+      </w:r>
+      <w:r>
+        <w:t xml:space="preserve"> "</w:t>
+      </w:r>
+      <w:proofErr w:type="spellStart"/>
+      <w:r>
+        <w:t>ei</w:t>
+      </w:r>
+      <w:proofErr w:type="spellEnd"/>
+      <w:r>
+        <w:t>"</w:t>
+      </w:r>
+      <w:r>
+        <w:rPr>
+          <w:b/>
+          <w:bCs/>
+        </w:rPr>
+        <w:t>,</w:t>
+      </w:r>
+      <w:r>
+        <w:t xml:space="preserve"> options</w:t>
+      </w:r>
+      <w:r>
+        <w:rPr>
+          <w:b/>
+          <w:bCs/>
+        </w:rPr>
+        <w:t>:</w:t>
+      </w:r>
+      <w:r>
+        <w:t xml:space="preserve"> ["</w:t>
+      </w:r>
+      <w:proofErr w:type="spellStart"/>
+      <w:r>
+        <w:t>ei</w:t>
+      </w:r>
+      <w:proofErr w:type="spellEnd"/>
+      <w:r>
+        <w:t>"</w:t>
+      </w:r>
+      <w:r>
+        <w:rPr>
+          <w:b/>
+          <w:bCs/>
+        </w:rPr>
+        <w:t>,</w:t>
+      </w:r>
+      <w:r>
+        <w:t xml:space="preserve"> "</w:t>
+      </w:r>
+      <w:proofErr w:type="spellStart"/>
+      <w:r>
+        <w:t>ie</w:t>
+      </w:r>
+      <w:proofErr w:type="spellEnd"/>
+      <w:r>
+        <w:t>"</w:t>
+      </w:r>
+      <w:r>
+        <w:rPr>
+          <w:b/>
+          <w:bCs/>
+        </w:rPr>
+        <w:t>,</w:t>
+      </w:r>
+      <w:r>
+        <w:t xml:space="preserve"> "</w:t>
+      </w:r>
+      <w:proofErr w:type="spellStart"/>
+      <w:r>
+        <w:t>ea</w:t>
+      </w:r>
+      <w:proofErr w:type="spellEnd"/>
+      <w:r>
+        <w:t>"</w:t>
+      </w:r>
+      <w:r>
+        <w:rPr>
+          <w:b/>
+          <w:bCs/>
+        </w:rPr>
+        <w:t>,</w:t>
+      </w:r>
+      <w:r>
+        <w:t xml:space="preserve"> "ee"] }</w:t>
+      </w:r>
+      <w:r>
+        <w:rPr>
+          <w:b/>
+          <w:bCs/>
+        </w:rPr>
+        <w:t>,</w:t>
+      </w:r>
+    </w:p>
+    <w:p>
+      <w:pPr>
+        <w:rPr>
+          <w:b/>
+          <w:bCs/>
+        </w:rPr>
+      </w:pPr>
+      <w:proofErr w:type="gramEnd"/>
       <w:r>
         <w:rPr>
           <w:b/>

</xml_diff>